<commit_message>
new figures script revised for efficiency
</commit_message>
<xml_diff>
--- a/figures/table_S1_sensitivity.docx
+++ b/figures/table_S1_sensitivity.docx
@@ -709,7 +709,7 @@
                 <w:szCs w:val="22"/>
                 <w:color w:val="000000"/>
               </w:rPr>
-              <w:t xml:space="preserve">25%</w:t>
+              <w:t xml:space="preserve">10%</w:t>
             </w:r>
           </w:p>
         </w:tc>
@@ -817,7 +817,7 @@
                 <w:szCs w:val="22"/>
                 <w:color w:val="000000"/>
               </w:rPr>
-              <w:t xml:space="preserve">733</w:t>
+              <w:t xml:space="preserve">1,002</w:t>
             </w:r>
           </w:p>
         </w:tc>
@@ -871,7 +871,7 @@
                 <w:szCs w:val="22"/>
                 <w:color w:val="000000"/>
               </w:rPr>
-              <w:t xml:space="preserve">946</w:t>
+              <w:t xml:space="preserve">677</w:t>
             </w:r>
           </w:p>
         </w:tc>
@@ -925,7 +925,7 @@
                 <w:szCs w:val="22"/>
                 <w:color w:val="000000"/>
               </w:rPr>
-              <w:t xml:space="preserve">43.7</w:t>
+              <w:t xml:space="preserve">59.7</w:t>
             </w:r>
           </w:p>
         </w:tc>
@@ -979,7 +979,7 @@
                 <w:szCs w:val="22"/>
                 <w:color w:val="000000"/>
               </w:rPr>
-              <w:t xml:space="preserve">212</w:t>
+              <w:t xml:space="preserve">131</w:t>
             </w:r>
           </w:p>
         </w:tc>
@@ -1033,7 +1033,7 @@
                 <w:szCs w:val="22"/>
                 <w:color w:val="000000"/>
               </w:rPr>
-              <w:t xml:space="preserve">201</w:t>
+              <w:t xml:space="preserve">147</w:t>
             </w:r>
           </w:p>
         </w:tc>
@@ -1087,7 +1087,7 @@
                 <w:szCs w:val="22"/>
                 <w:color w:val="000000"/>
               </w:rPr>
-              <w:t xml:space="preserve">64</w:t>
+              <w:t xml:space="preserve">41</w:t>
             </w:r>
           </w:p>
         </w:tc>
@@ -1147,7 +1147,7 @@
                 <w:szCs w:val="22"/>
                 <w:color w:val="000000"/>
               </w:rPr>
-              <w:t xml:space="preserve">50%</w:t>
+              <w:t xml:space="preserve">25%</w:t>
             </w:r>
           </w:p>
         </w:tc>
@@ -1255,7 +1255,7 @@
                 <w:szCs w:val="22"/>
                 <w:color w:val="000000"/>
               </w:rPr>
-              <w:t xml:space="preserve">484</w:t>
+              <w:t xml:space="preserve">733</w:t>
             </w:r>
           </w:p>
         </w:tc>
@@ -1309,7 +1309,7 @@
                 <w:szCs w:val="22"/>
                 <w:color w:val="000000"/>
               </w:rPr>
-              <w:t xml:space="preserve">1,195</w:t>
+              <w:t xml:space="preserve">946</w:t>
             </w:r>
           </w:p>
         </w:tc>
@@ -1363,7 +1363,7 @@
                 <w:szCs w:val="22"/>
                 <w:color w:val="000000"/>
               </w:rPr>
-              <w:t xml:space="preserve">28.8</w:t>
+              <w:t xml:space="preserve">43.7</w:t>
             </w:r>
           </w:p>
         </w:tc>
@@ -1417,7 +1417,7 @@
                 <w:szCs w:val="22"/>
                 <w:color w:val="000000"/>
               </w:rPr>
-              <w:t xml:space="preserve">283</w:t>
+              <w:t xml:space="preserve">212</w:t>
             </w:r>
           </w:p>
         </w:tc>
@@ -1471,7 +1471,7 @@
                 <w:szCs w:val="22"/>
                 <w:color w:val="000000"/>
               </w:rPr>
-              <w:t xml:space="preserve">268</w:t>
+              <w:t xml:space="preserve">201</w:t>
             </w:r>
           </w:p>
         </w:tc>
@@ -1525,7 +1525,7 @@
                 <w:szCs w:val="22"/>
                 <w:color w:val="000000"/>
               </w:rPr>
-              <w:t xml:space="preserve">100</w:t>
+              <w:t xml:space="preserve">64</w:t>
             </w:r>
           </w:p>
         </w:tc>
@@ -1585,7 +1585,7 @@
                 <w:szCs w:val="22"/>
                 <w:color w:val="000000"/>
               </w:rPr>
-              <w:t xml:space="preserve">75%</w:t>
+              <w:t xml:space="preserve">50%</w:t>
             </w:r>
           </w:p>
         </w:tc>
@@ -1693,7 +1693,7 @@
                 <w:szCs w:val="22"/>
                 <w:color w:val="000000"/>
               </w:rPr>
-              <w:t xml:space="preserve">315</w:t>
+              <w:t xml:space="preserve">484</w:t>
             </w:r>
           </w:p>
         </w:tc>
@@ -1747,7 +1747,7 @@
                 <w:szCs w:val="22"/>
                 <w:color w:val="000000"/>
               </w:rPr>
-              <w:t xml:space="preserve">1,364</w:t>
+              <w:t xml:space="preserve">1,195</w:t>
             </w:r>
           </w:p>
         </w:tc>
@@ -1801,7 +1801,7 @@
                 <w:szCs w:val="22"/>
                 <w:color w:val="000000"/>
               </w:rPr>
-              <w:t xml:space="preserve">18.8</w:t>
+              <w:t xml:space="preserve">28.8</w:t>
             </w:r>
           </w:p>
         </w:tc>
@@ -1855,7 +1855,7 @@
                 <w:szCs w:val="22"/>
                 <w:color w:val="000000"/>
               </w:rPr>
-              <w:t xml:space="preserve">334</w:t>
+              <w:t xml:space="preserve">283</w:t>
             </w:r>
           </w:p>
         </w:tc>
@@ -1909,7 +1909,7 @@
                 <w:szCs w:val="22"/>
                 <w:color w:val="000000"/>
               </w:rPr>
-              <w:t xml:space="preserve">316</w:t>
+              <w:t xml:space="preserve">268</w:t>
             </w:r>
           </w:p>
         </w:tc>
@@ -1963,7 +1963,7 @@
                 <w:szCs w:val="22"/>
                 <w:color w:val="000000"/>
               </w:rPr>
-              <w:t xml:space="preserve">123</w:t>
+              <w:t xml:space="preserve">100</w:t>
             </w:r>
           </w:p>
         </w:tc>
@@ -2023,7 +2023,7 @@
                 <w:szCs w:val="22"/>
                 <w:color w:val="000000"/>
               </w:rPr>
-              <w:t xml:space="preserve">100%</w:t>
+              <w:t xml:space="preserve">75%</w:t>
             </w:r>
           </w:p>
         </w:tc>
@@ -2131,7 +2131,7 @@
                 <w:szCs w:val="22"/>
                 <w:color w:val="000000"/>
               </w:rPr>
-              <w:t xml:space="preserve">16</w:t>
+              <w:t xml:space="preserve">315</w:t>
             </w:r>
           </w:p>
         </w:tc>
@@ -2185,7 +2185,7 @@
                 <w:szCs w:val="22"/>
                 <w:color w:val="000000"/>
               </w:rPr>
-              <w:t xml:space="preserve">1,663</w:t>
+              <w:t xml:space="preserve">1,364</w:t>
             </w:r>
           </w:p>
         </w:tc>
@@ -2239,7 +2239,7 @@
                 <w:szCs w:val="22"/>
                 <w:color w:val="000000"/>
               </w:rPr>
-              <w:t xml:space="preserve">1.0</w:t>
+              <w:t xml:space="preserve">18.8</w:t>
             </w:r>
           </w:p>
         </w:tc>
@@ -2293,7 +2293,7 @@
                 <w:szCs w:val="22"/>
                 <w:color w:val="000000"/>
               </w:rPr>
-              <w:t xml:space="preserve">423</w:t>
+              <w:t xml:space="preserve">334</w:t>
             </w:r>
           </w:p>
         </w:tc>
@@ -2347,7 +2347,7 @@
                 <w:szCs w:val="22"/>
                 <w:color w:val="000000"/>
               </w:rPr>
-              <w:t xml:space="preserve">417</w:t>
+              <w:t xml:space="preserve">316</w:t>
             </w:r>
           </w:p>
         </w:tc>
@@ -2401,7 +2401,7 @@
                 <w:szCs w:val="22"/>
                 <w:color w:val="000000"/>
               </w:rPr>
-              <w:t xml:space="preserve">172</w:t>
+              <w:t xml:space="preserve">123</w:t>
             </w:r>
           </w:p>
         </w:tc>

</xml_diff>